<commit_message>
feat: upscale output, config import/export, GPU CUDA fix, hawaii footage pull, pipeline enhancements
- Add upscale_output flag to pipeline — increases output video resolution via enhancer
- Add config JSON export/import (SAVE/LOAD buttons) to GUI
- Fix .venv CUDA torch: pin torch/torchvision to pytorch-cu128 index in pyproject.toml
- Add start.ps1 launcher (uv run --extra enhance) to prevent basicsr stripping
- Fix goakamai.org URL typo in pull_traffic_footage.py (was gookami.org)
- Add hawaii_H1_waimalu traffic footage to data/samples/traffic/
- Update progress_report_3.md and DOCX with April 22 meeting notes
- Update ROADMAP, DEV.md, README with sprint completions

Co-Authored-By: Claude Sonnet 4.6 <noreply@anthropic.com>
</commit_message>
<xml_diff>
--- a/Progress_Report_3_EGN4950C.docx
+++ b/Progress_Report_3_EGN4950C.docx
@@ -268,7 +268,7 @@
           <w:sz w:val="24"/>
           <w:szCs w:val="24"/>
         </w:rPr>
-        <w:t xml:space="preserve">Yes</w:t>
+        <w:t xml:space="preserve">Yes, two meetings.</w:t>
       </w:r>
     </w:p>
     <w:p>
@@ -347,6 +347,89 @@
           <w:szCs w:val="24"/>
         </w:rPr>
         <w:t xml:space="preserve">Cody and Geena also asked for per-mode CPU and battery draw benchmarks. The field scenario: a laptop plugged directly into a camera, running for hours on battery with no network. They need CPU% and encode time per mode to make hardware decisions for deployment. That work is open and assigned to Jorge.</w:t>
+      </w:r>
+    </w:p>
+    <w:p>
+      <w:pPr>
+        <w:spacing w:after="120"/>
+      </w:pPr>
+    </w:p>
+    <w:p>
+      <w:pPr>
+        <w:spacing w:after="120" w:before="0"/>
+      </w:pPr>
+      <w:r>
+        <w:rPr>
+          <w:rFonts w:ascii="Times New Roman" w:cs="Times New Roman" w:eastAsia="Times New Roman" w:hAnsi="Times New Roman"/>
+          <w:sz w:val="24"/>
+          <w:szCs w:val="24"/>
+        </w:rPr>
+        <w:t xml:space="preserve">April 22, 2026. Attendees: Riley Roberts, Cody Hayashi (CIV, NIWC Pacific), Geena Wann-Kung (CIV, NIWC Pacific). Kheiven was not present. Duration: approximately 35 minutes.</w:t>
+      </w:r>
+    </w:p>
+    <w:p>
+      <w:pPr>
+        <w:spacing w:after="120" w:before="0"/>
+      </w:pPr>
+      <w:r>
+        <w:rPr>
+          <w:rFonts w:ascii="Times New Roman" w:cs="Times New Roman" w:eastAsia="Times New Roman" w:hAnsi="Times New Roman"/>
+          <w:sz w:val="24"/>
+          <w:szCs w:val="24"/>
+        </w:rPr>
+        <w:t xml:space="preserve">Riley ran the demo and showed Mode 2 and Mode 3 for the first time. File sizes on the same test clip: Mode 0 at 76 MB, Mode 1 at 67 MB, Mode 2 at 30 MB, Mode 3 at 17 MB. Cody's read: the product is starting to look real.</w:t>
+      </w:r>
+    </w:p>
+    <w:p>
+      <w:pPr>
+        <w:spacing w:after="120" w:before="0"/>
+      </w:pPr>
+      <w:r>
+        <w:rPr>
+          <w:rFonts w:ascii="Times New Roman" w:cs="Times New Roman" w:eastAsia="Times New Roman" w:hAnsi="Times New Roman"/>
+          <w:sz w:val="24"/>
+          <w:szCs w:val="24"/>
+        </w:rPr>
+        <w:t xml:space="preserve">Cody pushed on the Mode 2 background update question again. His suggestion: rather than storing a live-updating background on the edge device, keep the last known clean frame and reconstruct context at playback time on a more powerful machine. The edge device is constrained; the playback environment is not. Geena added that operators want the ability to pick a time window and stitch segments together themselves if the device has storage headroom.</w:t>
+      </w:r>
+    </w:p>
+    <w:p>
+      <w:pPr>
+        <w:spacing w:after="120" w:before="0"/>
+      </w:pPr>
+      <w:r>
+        <w:rPr>
+          <w:rFonts w:ascii="Times New Roman" w:cs="Times New Roman" w:eastAsia="Times New Roman" w:hAnsi="Times New Roman"/>
+          <w:sz w:val="24"/>
+          <w:szCs w:val="24"/>
+        </w:rPr>
+        <w:t xml:space="preserve">Metrics came up as the main open gap. Cody said good per-mode CPU, encode-time, and latency data could support academic publishing after the class ends. He wants all benchmarks run on low-power hardware like a Raspberry Pi, not just development machines. He also wants an honest super-resolution test on real low-resolution footage, not a best-case demo.</w:t>
+      </w:r>
+    </w:p>
+    <w:p>
+      <w:pPr>
+        <w:spacing w:after="120" w:before="0"/>
+      </w:pPr>
+      <w:r>
+        <w:rPr>
+          <w:rFonts w:ascii="Times New Roman" w:cs="Times New Roman" w:eastAsia="Times New Roman" w:hAnsi="Times New Roman"/>
+          <w:sz w:val="24"/>
+          <w:szCs w:val="24"/>
+        </w:rPr>
+        <w:t xml:space="preserve">On detection accuracy, Cody's framing: the question is not just false positive rate, it is whether the false negatives matter. If the system misses a pedestrian who is too small and blurry to identify anyway, that is not a meaningful miss. His suggestion: filter by confidence score and bounding box size together. A high-confidence detection on a tiny box is usually a false positive. A large box with moderate confidence is usually real.</w:t>
+      </w:r>
+    </w:p>
+    <w:p>
+      <w:pPr>
+        <w:spacing w:after="120" w:before="0"/>
+      </w:pPr>
+      <w:r>
+        <w:rPr>
+          <w:rFonts w:ascii="Times New Roman" w:cs="Times New Roman" w:eastAsia="Times New Roman" w:hAnsi="Times New Roman"/>
+          <w:sz w:val="24"/>
+          <w:szCs w:val="24"/>
+        </w:rPr>
+        <w:t xml:space="preserve">Geena asked for test footage from a camera with oncoming traffic rather than a side view, and pointed to a Pearl City intersection as a good candidate. She and Cody both want footage showing high variance: the same camera at rush hour and at 2am, so Mode 1's storage advantage is visible on a real scene. Cody offered to attend the May 6 class presentation remotely if the team sends an invite.</w:t>
       </w:r>
     </w:p>
     <w:p>

</xml_diff>